<commit_message>
Consumo y costo real: embeddings, desglose entrada/salida y costo por modelo
- Cuenta embeddings (pregunta y carga de documentos) en el consumo y el límite
- Cuenta tokens de razonamiento de Gemini 2.5 como salida y el descuento de caché de OpenAI
- Costo en USD por modelo (pricing.py), guardado por mensaje al momento de la consulta
- Migración 0015: desglose y costo por bot y por mensaje (NUMERIC con 10 decimales)
- Dashboard: desglose del consumo, costo global y por bot, y detalle por modelo y por día
- Reemplaza la tarifa fija de $0.15/1M que se mostraba para todos los modelos
- Manual de administrador actualizado (.md y .docx)

Co-Authored-By: Claude Sonnet 5 <noreply@anthropic.com>
</commit_message>
<xml_diff>
--- a/docs/manual-administrador.docx
+++ b/docs/manual-administrador.docx
@@ -1040,7 +1040,7 @@
         <w:pStyle w:val="Heading3"/>
       </w:pPr>
       <w:r>
-        <w:t>5.3 Alcance del cálculo de gasto</w:t>
+        <w:t>5.3 Qué se cuenta y cómo se estima el gasto</w:t>
       </w:r>
     </w:p>
     <w:p>
@@ -1048,12 +1048,21 @@
         <w:pStyle w:val="ListBullet"/>
       </w:pPr>
       <w:r>
-        <w:t>El consumo cuenta los tokens del chat. La carga de embeddings de documentos se paga aparte</w:t>
+        <w:t xml:space="preserve">El límite mensual cuenta </w:t>
+      </w:r>
+      <w:r>
+        <w:rPr>
+          <w:b/>
+        </w:rPr>
+        <w:t>todos los tokens</w:t>
+      </w:r>
+      <w:r>
+        <w:t xml:space="preserve"> del bot: entrada y salida del modelo de chat,</w:t>
       </w:r>
     </w:p>
     <w:p>
       <w:r>
-        <w:t>con la key del proveedor de embeddings del servidor.</w:t>
+        <w:t>más los embeddings (la pregunta de cada consulta y la carga de documentos).</w:t>
       </w:r>
     </w:p>
     <w:p>
@@ -1061,6 +1070,106 @@
         <w:pStyle w:val="ListBullet"/>
       </w:pPr>
       <w:r>
+        <w:t>Se cuenta también el razonamiento interno de los modelos que lo cobran como salida (por ejemplo,</w:t>
+      </w:r>
+    </w:p>
+    <w:p>
+      <w:r>
+        <w:t>algunos modelos de Google).</w:t>
+      </w:r>
+    </w:p>
+    <w:p>
+      <w:pPr>
+        <w:pStyle w:val="ListBullet"/>
+      </w:pPr>
+      <w:r>
+        <w:t xml:space="preserve">El </w:t>
+      </w:r>
+      <w:r>
+        <w:rPr>
+          <w:b/>
+        </w:rPr>
+        <w:t>costo estimado en USD</w:t>
+      </w:r>
+      <w:r>
+        <w:t xml:space="preserve"> usa los precios de lista del proveedor para cada modelo, separando</w:t>
+      </w:r>
+    </w:p>
+    <w:p>
+      <w:r>
+        <w:t>entrada, salida (con descuento por caché cuando el proveedor lo aplica) y embeddings. Cada consulta</w:t>
+      </w:r>
+    </w:p>
+    <w:p>
+      <w:r>
+        <w:t>guarda su costo al momento de hacerse, así que un cambio de precio futuro no altera el histórico.</w:t>
+      </w:r>
+    </w:p>
+    <w:p>
+      <w:pPr>
+        <w:pStyle w:val="ListBullet"/>
+      </w:pPr>
+      <w:r>
+        <w:t xml:space="preserve">Los embeddings de Google no informan sus tokens, así que se </w:t>
+      </w:r>
+      <w:r>
+        <w:rPr>
+          <w:b/>
+        </w:rPr>
+        <w:t>estiman</w:t>
+      </w:r>
+      <w:r>
+        <w:t xml:space="preserve"> por longitud del texto.</w:t>
+      </w:r>
+    </w:p>
+    <w:p>
+      <w:pPr>
+        <w:pStyle w:val="ListBullet"/>
+      </w:pPr>
+      <w:r>
+        <w:t>Si un modelo no tiene precio cargado en el sistema, sus consultas cuentan tokens pero no costo; el</w:t>
+      </w:r>
+    </w:p>
+    <w:p>
+      <w:r>
+        <w:t>desglose lo marca como "sin precio".</w:t>
+      </w:r>
+    </w:p>
+    <w:p>
+      <w:pPr>
+        <w:pStyle w:val="ListBullet"/>
+      </w:pPr>
+      <w:r>
+        <w:t xml:space="preserve">El costo es una </w:t>
+      </w:r>
+      <w:r>
+        <w:rPr>
+          <w:b/>
+        </w:rPr>
+        <w:t>aproximación</w:t>
+      </w:r>
+      <w:r>
+        <w:t>, no la factura real. Para el monto exacto, consultar el panel del</w:t>
+      </w:r>
+    </w:p>
+    <w:p>
+      <w:r>
+        <w:t>proveedor.</w:t>
+      </w:r>
+    </w:p>
+    <w:p>
+      <w:pPr>
+        <w:pStyle w:val="Heading3"/>
+      </w:pPr>
+      <w:r>
+        <w:t>5.4 Desglose del consumo</w:t>
+      </w:r>
+    </w:p>
+    <w:p>
+      <w:pPr>
+        <w:pStyle w:val="ListBullet"/>
+      </w:pPr>
+      <w:r>
         <w:t xml:space="preserve">En </w:t>
       </w:r>
       <w:r>
@@ -1070,21 +1179,29 @@
         <w:t>Estadísticas</w:t>
       </w:r>
       <w:r>
-        <w:t xml:space="preserve">, el "costo estimado" es una </w:t>
+        <w:t xml:space="preserve"> de cada bot, la sección </w:t>
       </w:r>
       <w:r>
         <w:rPr>
           <w:b/>
         </w:rPr>
-        <w:t>aproximación</w:t>
-      </w:r>
-      <w:r>
-        <w:t xml:space="preserve"> fija (tarifa de referencia),</w:t>
+        <w:t>Consumo por modelo y por día</w:t>
+      </w:r>
+      <w:r>
+        <w:t xml:space="preserve"> muestra entrada,</w:t>
       </w:r>
     </w:p>
     <w:p>
       <w:r>
-        <w:t>no la factura real del proveedor. Para el costo exacto, consultar el panel del proveedor.</w:t>
+        <w:t>salida, embeddings, total y costo por modelo, y la serie de los últimos 30 días.</w:t>
+      </w:r>
+    </w:p>
+    <w:p>
+      <w:pPr>
+        <w:pStyle w:val="ListBullet"/>
+      </w:pPr>
+      <w:r>
+        <w:t>La diferencia entre los embeddings del total y los de las consultas es la carga de documentos.</w:t>
       </w:r>
     </w:p>
     <w:p>
@@ -1931,7 +2048,12 @@
         <w:t>Estadísticas (por bot):</w:t>
       </w:r>
       <w:r>
-        <w:t xml:space="preserve"> conversaciones, mensajes, tokens usados y costo estimado.</w:t>
+        <w:t xml:space="preserve"> conversaciones, mensajes, tokens usados (desglosados), costo estimado en</w:t>
+      </w:r>
+    </w:p>
+    <w:p>
+      <w:r>
+        <w:t>USD y consumo por modelo y por día.</w:t>
       </w:r>
     </w:p>
     <w:p>
@@ -2265,7 +2387,7 @@
         <w:pStyle w:val="ListBullet"/>
       </w:pPr>
       <w:r>
-        <w:t>El costo estimado de Estadísticas es referencial.</w:t>
+        <w:t>El costo estimado de Estadísticas es una aproximación según los precios de lista (ver sección 5.3).</w:t>
       </w:r>
     </w:p>
     <w:p>

</xml_diff>

<commit_message>
Rebranding: RAGBot -> Matriabot
Reemplaza el nombre de marca en todo lo visible: título y logo del
dashboard, pie del widget ('Powered by'), clase y objeto JS global
(window.Matriabot), APP_NAME (asunto de emails de alerta, título de
la API), README, manual de administrador (.md y .docx), demo.html y
preview.html.

Deliberadamente sin tocar (son infraestructura real, no marca):
- La base de datos ragbot_db
- La URL /ragbot, ya embebida en bots publicados en sitios de gobierno
- Nombres de contenedores Docker y el servicio systemd (ragbot.service)
  en los scripts de deploy y docker-compose

Verificado: 120 pruebas automatizadas de funcionalidades anteriores,
todas en verde; sintaxis JS validada en widget.js y las 4 páginas HTML
tocadas.

Co-Authored-By: Claude Sonnet 5 <noreply@anthropic.com>
</commit_message>
<xml_diff>
--- a/docs/manual-administrador.docx
+++ b/docs/manual-administrador.docx
@@ -7,7 +7,7 @@
         <w:pStyle w:val="Title"/>
       </w:pPr>
       <w:r>
-        <w:t>Manual del administrador — RAGBot</w:t>
+        <w:t>Manual del administrador — Matriabot</w:t>
       </w:r>
     </w:p>
     <w:p>
@@ -21,7 +21,7 @@
         <w:t>dashboard</w:t>
       </w:r>
       <w:r>
-        <w:t xml:space="preserve"> de RAGBot para crear y configurar chatbots,</w:t>
+        <w:t xml:space="preserve"> de Matriabot para crear y configurar chatbots,</w:t>
       </w:r>
     </w:p>
     <w:p>

</xml_diff>